<commit_message>
Add Feng Shui and BMI Body Profile features
</commit_message>
<xml_diff>
--- a/exhibition_guide.docx
+++ b/exhibition_guide.docx
@@ -2,13 +2,29 @@
 <file path=word/document.xml><?xml version="1.0" encoding="utf-8"?>
 <w:document xmlns:w="http://schemas.openxmlformats.org/wordprocessingml/2006/main" xmlns:m="http://schemas.openxmlformats.org/officeDocument/2006/math" xmlns:r="http://schemas.openxmlformats.org/officeDocument/2006/relationships" xmlns:o="urn:schemas-microsoft-com:office:office" xmlns:v="urn:schemas-microsoft-com:vml" xmlns:w10="urn:schemas-microsoft-com:office:word" xmlns:a="http://schemas.openxmlformats.org/drawingml/2006/main" xmlns:pic="http://schemas.openxmlformats.org/drawingml/2006/picture" xmlns:wp="http://schemas.openxmlformats.org/drawingml/2006/wordprocessingDrawing">
   <w:body>
-    <w:bookmarkStart w:id="17" w:name="Xd1a6d62efca55838b4ff1b42e1826a526f0c889"/>
+    <w:p>
+      <w:pPr>
+        <w:pStyle w:val="Title"/>
+      </w:pPr>
+      <w:r>
+        <w:t xml:space="preserve">KỊCH BẢN &amp; HƯỚNG DẪN DEMO: AI PERSONAL STYLIST</w:t>
+      </w:r>
+    </w:p>
+    <w:p>
+      <w:pPr>
+        <w:pStyle w:val="Date"/>
+      </w:pPr>
+      <w:r>
+        <w:t xml:space="preserve">Bản cập nhật mới nhất - Phiên bản Premium UI</w:t>
+      </w:r>
+    </w:p>
+    <w:bookmarkStart w:id="17" w:name="kịch-bản-hướng-dẫn-trình-bày-đồ-án"/>
     <w:p>
       <w:pPr>
         <w:pStyle w:val="Heading1"/>
       </w:pPr>
       <w:r>
-        <w:t xml:space="preserve">TÀI LIỆU HƯỚNG DẪN DEMO TẠI GIAN HÀNG (Dành cho thành viên hỗ trợ)</w:t>
+        <w:t xml:space="preserve">KỊCH BẢN &amp; HƯỚNG DẪN TRÌNH BÀY ĐỒ ÁN</w:t>
       </w:r>
     </w:p>
     <w:p>
@@ -17,38 +33,10 @@
       </w:pPr>
       <w:r>
         <w:rPr>
-          <w:i/>
-          <w:iCs/>
-        </w:rPr>
-        <w:t xml:space="preserve">Tài liệu này giúp các bạn trực gian hàng hiểu rõ ứng dụng</w:t>
-      </w:r>
-      <w:r>
-        <w:rPr>
-          <w:i/>
-          <w:iCs/>
-        </w:rPr>
-        <w:t xml:space="preserve"> </w:t>
-      </w:r>
-      <w:r>
-        <w:rPr>
-          <w:i/>
-          <w:iCs/>
-        </w:rPr>
-        <w:t xml:space="preserve">“AI Personal Stylist”</w:t>
-      </w:r>
-      <w:r>
-        <w:rPr>
-          <w:i/>
-          <w:iCs/>
-        </w:rPr>
-        <w:t xml:space="preserve"> </w:t>
-      </w:r>
-      <w:r>
-        <w:rPr>
-          <w:i/>
-          <w:iCs/>
-        </w:rPr>
-        <w:t xml:space="preserve">làm được gì và cách bấm điện thoại/web để demo (trình diễn) cho khách xem một cách trơn tru nhất.</w:t>
+          <w:b/>
+          <w:bCs/>
+        </w:rPr>
+        <w:t xml:space="preserve">Dự án: AI Personal Stylist - Trợ lý thời trang cá nhân thông minh</w:t>
       </w:r>
     </w:p>
     <w:p>
@@ -58,13 +46,13 @@
         </w:pict>
       </w:r>
     </w:p>
-    <w:bookmarkStart w:id="9" w:name="tổng-quan-dự-án"/>
+    <w:bookmarkStart w:id="9" w:name="lời-mở-đầu-gây-ấn-tượng-ban-đầu"/>
     <w:p>
       <w:pPr>
         <w:pStyle w:val="Heading2"/>
       </w:pPr>
       <w:r>
-        <w:t xml:space="preserve">TỔNG QUAN DỰ ÁN</w:t>
+        <w:t xml:space="preserve">1. LỜI MỞ ĐẦU (Gây ấn tượng ban đầu)</w:t>
       </w:r>
     </w:p>
     <w:p>
@@ -80,13 +68,29 @@
           <w:b/>
           <w:bCs/>
         </w:rPr>
-        <w:t xml:space="preserve">Tên ứng dụng:</w:t>
-      </w:r>
-      <w:r>
-        <w:t xml:space="preserve"> </w:t>
-      </w:r>
-      <w:r>
+        <w:t xml:space="preserve">Chào hỏi:</w:t>
+      </w:r>
+      <w:r>
+        <w:t xml:space="preserve"> </w:t>
+      </w:r>
+      <w:r>
+        <w:t xml:space="preserve">“Kính chào quý thầy cô và các bạn. Hôm nay, em xin phép trình bày dự án</w:t>
+      </w:r>
+      <w:r>
+        <w:t xml:space="preserve"> </w:t>
+      </w:r>
+      <w:r>
+        <w:rPr>
+          <w:b/>
+          <w:bCs/>
+        </w:rPr>
         <w:t xml:space="preserve">AI Personal Stylist</w:t>
+      </w:r>
+      <w:r>
+        <w:t xml:space="preserve"> </w:t>
+      </w:r>
+      <w:r>
+        <w:t xml:space="preserve">– không chỉ là một ứng dụng quản lý tủ đồ, mà còn là một trợ lý thời trang cá nhân thực thụ ứng dụng sức mạnh của Trí tuệ Nhân tạo.”</w:t>
       </w:r>
     </w:p>
     <w:p>
@@ -102,60 +106,39 @@
           <w:b/>
           <w:bCs/>
         </w:rPr>
-        <w:t xml:space="preserve">Chức năng chính:</w:t>
-      </w:r>
-      <w:r>
-        <w:t xml:space="preserve"> </w:t>
-      </w:r>
-      <w:r>
-        <w:t xml:space="preserve">Biến chiếc điện thoại thành</w:t>
-      </w:r>
-      <w:r>
-        <w:t xml:space="preserve"> </w:t>
-      </w:r>
-      <w:r>
-        <w:t xml:space="preserve">“Trợ lý thời trang”</w:t>
-      </w:r>
-      <w:r>
-        <w:t xml:space="preserve">, số hóa toàn bộ quần áo trong tủ và dùng AI để tự động mix-match đồ mỗi ngày dựa trên thời tiết, sự kiện, sở thích…</w:t>
-      </w:r>
-    </w:p>
-    <w:p>
-      <w:r>
-        <w:pict>
-          <v:rect style="width:0;height:1.5pt" o:hralign="center" o:hrstd="t" o:hr="t"/>
-        </w:pict>
-      </w:r>
-    </w:p>
-    <w:bookmarkEnd w:id="9"/>
-    <w:bookmarkStart w:id="16" w:name="hướng-dẫn-demo-chi-tiết-từng-tính-năng"/>
-    <w:p>
-      <w:pPr>
-        <w:pStyle w:val="Heading2"/>
-      </w:pPr>
-      <w:r>
-        <w:t xml:space="preserve">HƯỚNG DẪN DEMO CHI TIẾT TỪNG TÍNH NĂNG</w:t>
-      </w:r>
-    </w:p>
-    <w:bookmarkStart w:id="10" w:name="số-hóa-tủ-đồ-bằng-ai-digital-wardrobe"/>
-    <w:p>
-      <w:pPr>
-        <w:pStyle w:val="Heading3"/>
-      </w:pPr>
-      <w:r>
-        <w:t xml:space="preserve">1. Số hóa tủ đồ bằng AI (Digital Wardrobe)</w:t>
-      </w:r>
-    </w:p>
-    <w:p>
-      <w:pPr>
-        <w:pStyle w:val="FirstParagraph"/>
-      </w:pPr>
+        <w:t xml:space="preserve">Nêu vấn đề:</w:t>
+      </w:r>
+      <w:r>
+        <w:t xml:space="preserve"> </w:t>
+      </w:r>
+      <w:r>
+        <w:t xml:space="preserve">“Hầu hết chúng ta đều có rất nhiều quần áo, nhưng mỗi buổi sáng vẫn luôn tự hỏi:</w:t>
+      </w:r>
+      <w:r>
+        <w:t xml:space="preserve"> </w:t>
+      </w:r>
       <w:r>
         <w:rPr>
           <w:i/>
           <w:iCs/>
         </w:rPr>
-        <w:t xml:space="preserve">Ý nghĩa: Giải thích cho khách biết làm sao để đưa quần áo ngoài đời thật vào trong App.</w:t>
+        <w:t xml:space="preserve">‘Hôm nay mặc gì?’</w:t>
+      </w:r>
+      <w:r>
+        <w:t xml:space="preserve"> </w:t>
+      </w:r>
+      <w:r>
+        <w:t xml:space="preserve">Đồng thời, thời trang không chỉ là che chắn, nó là sự tự tin. Ứng dụng này sinh ra để giải quyết trọn vẹn cả hai vấn đề đó.”</w:t>
+      </w:r>
+    </w:p>
+    <w:bookmarkEnd w:id="9"/>
+    <w:bookmarkStart w:id="10" w:name="những-điểm-nhấn-công-nghệ-chính"/>
+    <w:p>
+      <w:pPr>
+        <w:pStyle w:val="Heading2"/>
+      </w:pPr>
+      <w:r>
+        <w:t xml:space="preserve">2. NHỮNG ĐIỂM NHẤN CÔNG NGHỆ CHÍNH</w:t>
       </w:r>
     </w:p>
     <w:p>
@@ -171,144 +154,207 @@
           <w:b/>
           <w:bCs/>
         </w:rPr>
-        <w:t xml:space="preserve">Cách Demo:</w:t>
+        <w:t xml:space="preserve">Đa nền tảng:</w:t>
+      </w:r>
+      <w:r>
+        <w:t xml:space="preserve"> </w:t>
+      </w:r>
+      <w:r>
+        <w:t xml:space="preserve">Code 1 lần bằng Flutter, chạy mượt mà trên Mobile và Web (đang live trên Firebase Hosting).</w:t>
       </w:r>
     </w:p>
     <w:p>
       <w:pPr>
         <w:pStyle w:val="Compact"/>
         <w:numPr>
-          <w:ilvl w:val="1"/>
+          <w:ilvl w:val="0"/>
+          <w:numId w:val="1002"/>
+        </w:numPr>
+      </w:pPr>
+      <w:r>
+        <w:rPr>
+          <w:b/>
+          <w:bCs/>
+        </w:rPr>
+        <w:t xml:space="preserve">Core AI:</w:t>
+      </w:r>
+      <w:r>
+        <w:t xml:space="preserve"> </w:t>
+      </w:r>
+      <w:r>
+        <w:t xml:space="preserve">Ứng dụng tích hợp API của Google Gemini và Llama 3 (qua Groq) mang đến tốc độ phản hồi tính bằng mili-giây và khả năng phân tích ngữ cảnh trang phục thông minh.</w:t>
+      </w:r>
+    </w:p>
+    <w:p>
+      <w:pPr>
+        <w:pStyle w:val="Compact"/>
+        <w:numPr>
+          <w:ilvl w:val="0"/>
+          <w:numId w:val="1002"/>
+        </w:numPr>
+      </w:pPr>
+      <w:r>
+        <w:rPr>
+          <w:b/>
+          <w:bCs/>
+        </w:rPr>
+        <w:t xml:space="preserve">Trải nghiệm người dùng cao cấp (Premium UI/UX):</w:t>
+      </w:r>
+      <w:r>
+        <w:t xml:space="preserve"> </w:t>
+      </w:r>
+      <w:r>
+        <w:t xml:space="preserve">Giao diện liên tục được nâng cấp với các xu hướng thiết kế mới nhất như Glassmorphism (Kính mờ), hiệu ứng Gradient sinh động.</w:t>
+      </w:r>
+    </w:p>
+    <w:p>
+      <w:r>
+        <w:pict>
+          <v:rect style="width:0;height:1.5pt" o:hralign="center" o:hrstd="t" o:hr="t"/>
+        </w:pict>
+      </w:r>
+    </w:p>
+    <w:bookmarkEnd w:id="10"/>
+    <w:bookmarkStart w:id="15" w:name="kịch-bản-demo-thực-tế-step-by-step"/>
+    <w:p>
+      <w:pPr>
+        <w:pStyle w:val="Heading2"/>
+      </w:pPr>
+      <w:r>
+        <w:t xml:space="preserve">3. KỊCH BẢN DEMO THỰC TẾ (Step-by-step)</w:t>
+      </w:r>
+    </w:p>
+    <w:bookmarkStart w:id="11" w:name="X94da58a339168e16a1e24f94018aaedd6ec5a19"/>
+    <w:p>
+      <w:pPr>
+        <w:pStyle w:val="Heading3"/>
+      </w:pPr>
+      <w:r>
+        <w:t xml:space="preserve">Bước 1: Màn hình Home – Ấn tượng từ ánh nhìn đầu tiên</w:t>
+      </w:r>
+    </w:p>
+    <w:p>
+      <w:pPr>
+        <w:pStyle w:val="Compact"/>
+        <w:numPr>
+          <w:ilvl w:val="0"/>
           <w:numId w:val="1003"/>
         </w:numPr>
       </w:pPr>
       <w:r>
-        <w:t xml:space="preserve">Mở tab</w:t>
-      </w:r>
-      <w:r>
-        <w:t xml:space="preserve"> </w:t>
-      </w:r>
-      <w:r>
         <w:rPr>
           <w:b/>
           <w:bCs/>
         </w:rPr>
-        <w:t xml:space="preserve">“Tủ đồ”</w:t>
-      </w:r>
-      <w:r>
-        <w:t xml:space="preserve"> </w:t>
-      </w:r>
-      <w:r>
-        <w:t xml:space="preserve">(biểu tượng móc áo ở dưới cùng).</w:t>
+        <w:t xml:space="preserve">Thao tác:</w:t>
+      </w:r>
+      <w:r>
+        <w:t xml:space="preserve"> </w:t>
+      </w:r>
+      <w:r>
+        <w:t xml:space="preserve">Mở ứng dụng, dừng lại 3-5 giây ở màn hình Home để Hội đồng quan sát.</w:t>
       </w:r>
     </w:p>
     <w:p>
       <w:pPr>
         <w:pStyle w:val="Compact"/>
         <w:numPr>
-          <w:ilvl w:val="1"/>
+          <w:ilvl w:val="0"/>
           <w:numId w:val="1003"/>
         </w:numPr>
       </w:pPr>
       <w:r>
-        <w:t xml:space="preserve">Bấm vào nút dấu</w:t>
-      </w:r>
-      <w:r>
-        <w:t xml:space="preserve"> </w:t>
-      </w:r>
-      <w:r>
         <w:rPr>
           <w:b/>
           <w:bCs/>
         </w:rPr>
-        <w:t xml:space="preserve">“+”</w:t>
-      </w:r>
-      <w:r>
-        <w:t xml:space="preserve"> </w:t>
-      </w:r>
-      <w:r>
-        <w:t xml:space="preserve">màu tím ở giữa.</w:t>
-      </w:r>
-    </w:p>
-    <w:p>
-      <w:pPr>
-        <w:pStyle w:val="Compact"/>
-        <w:numPr>
-          <w:ilvl w:val="1"/>
-          <w:numId w:val="1003"/>
-        </w:numPr>
-      </w:pPr>
-      <w:r>
-        <w:t xml:space="preserve">Chọn tải lên một bức ảnh quần áo (Nên chuẩn bị sẵn 1-2 ảnh quần áo trong thư viện máy).</w:t>
-      </w:r>
-    </w:p>
-    <w:p>
-      <w:pPr>
-        <w:pStyle w:val="Compact"/>
-        <w:numPr>
-          <w:ilvl w:val="1"/>
-          <w:numId w:val="1003"/>
-        </w:numPr>
-      </w:pPr>
+        <w:t xml:space="preserve">Lời dẫn:</w:t>
+      </w:r>
+      <w:r>
+        <w:t xml:space="preserve"> </w:t>
+      </w:r>
+      <w:r>
+        <w:t xml:space="preserve">&gt;</w:t>
+      </w:r>
+      <w:r>
+        <w:t xml:space="preserve"> </w:t>
+      </w:r>
+      <w:r>
+        <w:rPr>
+          <w:i/>
+          <w:iCs/>
+        </w:rPr>
+        <w:t xml:space="preserve">“Ngay khi mở ứng dụng, người dùng được chào đón bởi một giao diện sang trọng. Chú ý phần Header được thiết kế theo phong cách Glassmorphism nổi bật trên nền Gradient Tím-Indigo. Bảng Thời Tiết thông minh (được thiết kế tối giản, tinh tế như các ứng dụng cao cấp) không chỉ báo nhiệt độ mà còn</w:t>
+      </w:r>
+      <w:r>
+        <w:rPr>
+          <w:i/>
+          <w:iCs/>
+        </w:rPr>
+        <w:t xml:space="preserve"> </w:t>
+      </w:r>
       <w:r>
         <w:rPr>
           <w:b/>
           <w:bCs/>
-        </w:rPr>
-        <w:t xml:space="preserve">Điểm nhấn để khoe khách:</w:t>
-      </w:r>
-      <w:r>
-        <w:t xml:space="preserve"> </w:t>
-      </w:r>
-      <w:r>
-        <w:t xml:space="preserve">“Bạn chỉ cần up ảnh, AI của bên mình sẽ tự động tách nền (xóa phông) trong 2 giây. Nó còn tự động nhận diện đây là Áo, Quần hay Giày và điền luôn màu sắc giúp bạn!”</w:t>
-      </w:r>
-    </w:p>
-    <w:p>
-      <w:pPr>
-        <w:pStyle w:val="Compact"/>
-        <w:numPr>
-          <w:ilvl w:val="1"/>
-          <w:numId w:val="1003"/>
-        </w:numPr>
-      </w:pPr>
-      <w:r>
-        <w:t xml:space="preserve">Bấm</w:t>
-      </w:r>
-      <w:r>
+          <w:i/>
+          <w:iCs/>
+        </w:rPr>
+        <w:t xml:space="preserve">gợi ý cách mặc đồ</w:t>
+      </w:r>
+      <w:r>
+        <w:rPr>
+          <w:i/>
+          <w:iCs/>
+        </w:rPr>
+        <w:t xml:space="preserve"> </w:t>
+      </w:r>
+      <w:r>
+        <w:rPr>
+          <w:i/>
+          <w:iCs/>
+        </w:rPr>
+        <w:t xml:space="preserve">phù hợp. Đặc biệt, ứng dụng sẽ luôn hiển thị một</w:t>
+      </w:r>
+      <w:r>
+        <w:rPr>
+          <w:i/>
+          <w:iCs/>
+        </w:rPr>
         <w:t xml:space="preserve"> </w:t>
       </w:r>
       <w:r>
         <w:rPr>
           <w:b/>
           <w:bCs/>
-        </w:rPr>
-        <w:t xml:space="preserve">“Lưu món đồ”</w:t>
-      </w:r>
-      <w:r>
-        <w:t xml:space="preserve">.</w:t>
-      </w:r>
-    </w:p>
-    <w:bookmarkEnd w:id="10"/>
-    <w:bookmarkStart w:id="11" w:name="ai-gợi-ý-phối-đồ-smart-outfit-suggestion"/>
-    <w:p>
-      <w:pPr>
-        <w:pStyle w:val="Heading3"/>
-      </w:pPr>
-      <w:r>
-        <w:t xml:space="preserve">2. AI Gợi Ý Phối Đồ (Smart Outfit Suggestion)</w:t>
-      </w:r>
-    </w:p>
-    <w:p>
-      <w:pPr>
-        <w:pStyle w:val="FirstParagraph"/>
-      </w:pPr>
-      <w:r>
-        <w:rPr>
           <w:i/>
           <w:iCs/>
         </w:rPr>
-        <w:t xml:space="preserve">Ý nghĩa: Tính năng cốt lõi, để AI làm stylist.</w:t>
+        <w:t xml:space="preserve">Trích dẫn thời trang kinh điển</w:t>
+      </w:r>
+      <w:r>
+        <w:rPr>
+          <w:i/>
+          <w:iCs/>
+        </w:rPr>
+        <w:t xml:space="preserve"> </w:t>
+      </w:r>
+      <w:r>
+        <w:rPr>
+          <w:i/>
+          <w:iCs/>
+        </w:rPr>
+        <w:t xml:space="preserve">mỗi ngày, mang lại cảm hứng mặc đẹp cho người dùng ngay giây phút đầu tiên.”</w:t>
+      </w:r>
+    </w:p>
+    <w:bookmarkEnd w:id="11"/>
+    <w:bookmarkStart w:id="12" w:name="bước-2-quản-lý-tủ-đồ-thông-minh"/>
+    <w:p>
+      <w:pPr>
+        <w:pStyle w:val="Heading3"/>
+      </w:pPr>
+      <w:r>
+        <w:t xml:space="preserve">Bước 2: Quản lý Tủ đồ thông minh</w:t>
       </w:r>
     </w:p>
     <w:p>
@@ -324,59 +370,135 @@
           <w:b/>
           <w:bCs/>
         </w:rPr>
-        <w:t xml:space="preserve">Cách Demo:</w:t>
+        <w:t xml:space="preserve">Thao tác:</w:t>
+      </w:r>
+      <w:r>
+        <w:t xml:space="preserve"> </w:t>
+      </w:r>
+      <w:r>
+        <w:t xml:space="preserve">Chuyển sang Tab</w:t>
+      </w:r>
+      <w:r>
+        <w:t xml:space="preserve"> </w:t>
+      </w:r>
+      <w:r>
+        <w:t xml:space="preserve">“Tủ đồ”</w:t>
+      </w:r>
+      <w:r>
+        <w:t xml:space="preserve">, click vào biểu tượng bộ lọc (Filter) và lướt qua danh sách đồ.</w:t>
       </w:r>
     </w:p>
     <w:p>
       <w:pPr>
         <w:pStyle w:val="Compact"/>
         <w:numPr>
-          <w:ilvl w:val="1"/>
+          <w:ilvl w:val="0"/>
+          <w:numId w:val="1004"/>
+        </w:numPr>
+      </w:pPr>
+      <w:r>
+        <w:rPr>
+          <w:b/>
+          <w:bCs/>
+        </w:rPr>
+        <w:t xml:space="preserve">Lời dẫn:</w:t>
+      </w:r>
+      <w:r>
+        <w:t xml:space="preserve"> </w:t>
+      </w:r>
+      <w:r>
+        <w:t xml:space="preserve">&gt;</w:t>
+      </w:r>
+      <w:r>
+        <w:t xml:space="preserve"> </w:t>
+      </w:r>
+      <w:r>
+        <w:rPr>
+          <w:i/>
+          <w:iCs/>
+        </w:rPr>
+        <w:t xml:space="preserve">“Với tủ đồ cá nhân, toàn bộ dữ liệu metadata (Màu sắc, Loại đồ, Phong cách, Mùa) được lưu trữ trên Firebase. Các bộ lọc được em thiết kế tối ưu, kết hợp với các Icon logic giúp người dùng phân loại trang phục chỉ bằng 1 chạm.”</w:t>
+      </w:r>
+    </w:p>
+    <w:bookmarkEnd w:id="12"/>
+    <w:bookmarkStart w:id="13" w:name="X483430ac03f96146eae1fc08f598434a57f5377"/>
+    <w:p>
+      <w:pPr>
+        <w:pStyle w:val="Heading3"/>
+      </w:pPr>
+      <w:r>
+        <w:t xml:space="preserve">Bước 3: Lên đồ theo sự kiện &amp; Llama 3 AI (Tính năng</w:t>
+      </w:r>
+      <w:r>
+        <w:t xml:space="preserve"> </w:t>
+      </w:r>
+      <w:r>
+        <w:t xml:space="preserve">“Ăn tiền”</w:t>
+      </w:r>
+      <w:r>
+        <w:t xml:space="preserve">)</w:t>
+      </w:r>
+    </w:p>
+    <w:p>
+      <w:pPr>
+        <w:pStyle w:val="Compact"/>
+        <w:numPr>
+          <w:ilvl w:val="0"/>
           <w:numId w:val="1005"/>
         </w:numPr>
       </w:pPr>
       <w:r>
-        <w:t xml:space="preserve">Chuyển sang tab</w:t>
-      </w:r>
-      <w:r>
-        <w:t xml:space="preserve"> </w:t>
-      </w:r>
-      <w:r>
         <w:rPr>
           <w:b/>
           <w:bCs/>
         </w:rPr>
+        <w:t xml:space="preserve">Thao tác:</w:t>
+      </w:r>
+      <w:r>
+        <w:t xml:space="preserve"> </w:t>
+      </w:r>
+      <w:r>
+        <w:t xml:space="preserve">Chuyển sang Tab</w:t>
+      </w:r>
+      <w:r>
+        <w:t xml:space="preserve"> </w:t>
+      </w:r>
+      <w:r>
         <w:t xml:space="preserve">“Phối đồ”</w:t>
       </w:r>
       <w:r>
-        <w:t xml:space="preserve"> </w:t>
-      </w:r>
-      <w:r>
-        <w:t xml:space="preserve">(biểu tượng ngôi sao).</w:t>
+        <w:t xml:space="preserve">, nhấn vào</w:t>
+      </w:r>
+      <w:r>
+        <w:t xml:space="preserve"> </w:t>
+      </w:r>
+      <w:r>
+        <w:t xml:space="preserve">“Lên đồ cho sự kiện”</w:t>
+      </w:r>
+      <w:r>
+        <w:t xml:space="preserve">.</w:t>
       </w:r>
     </w:p>
     <w:p>
       <w:pPr>
         <w:pStyle w:val="Compact"/>
         <w:numPr>
-          <w:ilvl w:val="1"/>
+          <w:ilvl w:val="0"/>
           <w:numId w:val="1005"/>
         </w:numPr>
       </w:pPr>
       <w:r>
-        <w:t xml:space="preserve">Chỉ cho khách thấy nhiệt độ thời tiết thực tế đang hiển thị trên cùng (Lấy dữ liệu thật).</w:t>
-      </w:r>
-    </w:p>
-    <w:p>
-      <w:pPr>
-        <w:pStyle w:val="Compact"/>
-        <w:numPr>
-          <w:ilvl w:val="1"/>
-          <w:numId w:val="1005"/>
-        </w:numPr>
-      </w:pPr>
-      <w:r>
-        <w:t xml:space="preserve">Chọn một Dịp/Sự kiện (VD:</w:t>
+        <w:rPr>
+          <w:b/>
+          <w:bCs/>
+        </w:rPr>
+        <w:t xml:space="preserve">Lời dẫn:</w:t>
+      </w:r>
+      <w:r>
+        <w:t xml:space="preserve"> </w:t>
+      </w:r>
+      <w:r>
+        <w:t xml:space="preserve">&gt;</w:t>
       </w:r>
       <w:r>
         <w:t xml:space="preserve"> </w:t>
@@ -386,132 +508,68 @@
           <w:i/>
           <w:iCs/>
         </w:rPr>
-        <w:t xml:space="preserve">Đi chơi, Đi học</w:t>
-      </w:r>
-      <w:r>
-        <w:t xml:space="preserve">).</w:t>
-      </w:r>
-    </w:p>
-    <w:p>
-      <w:pPr>
-        <w:pStyle w:val="Compact"/>
-        <w:numPr>
-          <w:ilvl w:val="1"/>
-          <w:numId w:val="1005"/>
-        </w:numPr>
-      </w:pPr>
-      <w:r>
-        <w:t xml:space="preserve">Bấm nút</w:t>
-      </w:r>
-      <w:r>
+        <w:t xml:space="preserve">“Khi chúng ta sắp có một sự kiện quan trọng, AI Personal Stylist sẽ lo phần trang phục. Ở đây có thẻ</w:t>
+      </w:r>
+      <w:r>
+        <w:rPr>
+          <w:i/>
+          <w:iCs/>
+        </w:rPr>
         <w:t xml:space="preserve"> </w:t>
       </w:r>
       <w:r>
         <w:rPr>
           <w:b/>
           <w:bCs/>
-        </w:rPr>
-        <w:t xml:space="preserve">“Phối Đồ Bằng AI”</w:t>
-      </w:r>
-      <w:r>
-        <w:t xml:space="preserve">.</w:t>
-      </w:r>
-    </w:p>
-    <w:p>
-      <w:pPr>
-        <w:pStyle w:val="Compact"/>
-        <w:numPr>
-          <w:ilvl w:val="1"/>
-          <w:numId w:val="1005"/>
-        </w:numPr>
-      </w:pPr>
-      <w:r>
-        <w:t xml:space="preserve">Đợi AI phân tích vài giây. Màn hình sẽ hiện ra bộ đồ được chọn.</w:t>
-      </w:r>
-    </w:p>
-    <w:p>
-      <w:pPr>
-        <w:pStyle w:val="Compact"/>
-        <w:numPr>
-          <w:ilvl w:val="1"/>
-          <w:numId w:val="1005"/>
-        </w:numPr>
-      </w:pPr>
-      <w:r>
-        <w:rPr>
-          <w:b/>
-          <w:bCs/>
-        </w:rPr>
-        <w:t xml:space="preserve">Điểm nhấn để khoe khách:</w:t>
-      </w:r>
-      <w:r>
-        <w:t xml:space="preserve"> </w:t>
-      </w:r>
-      <w:r>
-        <w:t xml:space="preserve">Đọc cho khách nghe phần văn bản AI giải thích bên dưới (VD:</w:t>
-      </w:r>
-      <w:r>
-        <w:t xml:space="preserve"> </w:t>
-      </w:r>
-      <w:r>
-        <w:rPr>
           <w:i/>
           <w:iCs/>
         </w:rPr>
-        <w:t xml:space="preserve">Trời hôm nay nắng nóng 35 độ, AI chọn áo thun mỏng và quần sáng màu để giúp bạn mát mẻ…</w:t>
-      </w:r>
-      <w:r>
-        <w:t xml:space="preserve">).</w:t>
-      </w:r>
-    </w:p>
-    <w:p>
-      <w:pPr>
-        <w:pStyle w:val="Compact"/>
-        <w:numPr>
-          <w:ilvl w:val="1"/>
-          <w:numId w:val="1005"/>
-        </w:numPr>
-      </w:pPr>
-      <w:r>
-        <w:t xml:space="preserve">Bấm nút</w:t>
-      </w:r>
-      <w:r>
-        <w:t xml:space="preserve"> </w:t>
-      </w:r>
-      <w:r>
-        <w:rPr>
-          <w:b/>
-          <w:bCs/>
-        </w:rPr>
-        <w:t xml:space="preserve">“Lưu Set đồ”</w:t>
-      </w:r>
-      <w:r>
-        <w:t xml:space="preserve"> </w:t>
-      </w:r>
-      <w:r>
-        <w:t xml:space="preserve">màu hồng để demo việc cất bộ này vào bộ sưu tập.</w:t>
-      </w:r>
-    </w:p>
-    <w:bookmarkEnd w:id="11"/>
-    <w:bookmarkStart w:id="12" w:name="quẹt-đồ-ngẫu-nhiên-tinder-mix-match"/>
-    <w:p>
-      <w:pPr>
-        <w:pStyle w:val="Heading3"/>
-      </w:pPr>
-      <w:r>
-        <w:t xml:space="preserve">3. Quẹt Đồ Ngẫu Nhiên (Tinder Mix &amp; Match)</w:t>
-      </w:r>
-    </w:p>
-    <w:p>
-      <w:pPr>
-        <w:pStyle w:val="FirstParagraph"/>
-      </w:pPr>
+        <w:t xml:space="preserve">Đếm ngược sự kiện</w:t>
+      </w:r>
       <w:r>
         <w:rPr>
           <w:i/>
           <w:iCs/>
         </w:rPr>
-        <w:t xml:space="preserve">Ý nghĩa: Biến việc chọn đồ mệt mỏi mỗi sáng thành trò chơi giải trí.</w:t>
+        <w:t xml:space="preserve"> </w:t>
+      </w:r>
+      <w:r>
+        <w:rPr>
+          <w:i/>
+          <w:iCs/>
+        </w:rPr>
+        <w:t xml:space="preserve">vô cùng trực quan. Chỉ cần nhập nội dung như</w:t>
+      </w:r>
+      <w:r>
+        <w:rPr>
+          <w:i/>
+          <w:iCs/>
+        </w:rPr>
+        <w:t xml:space="preserve"> </w:t>
+      </w:r>
+      <w:r>
+        <w:rPr>
+          <w:i/>
+          <w:iCs/>
+        </w:rPr>
+        <w:t xml:space="preserve">‘Đi dự tiệc cưới người yêu cũ’</w:t>
+      </w:r>
+      <w:r>
+        <w:rPr>
+          <w:i/>
+          <w:iCs/>
+        </w:rPr>
+        <w:t xml:space="preserve">, Trợ lý AI (với não bộ của Llama 3 / Gemini) sẽ lập tức tổng hợp phân tích thời tiết, phong cách và những món đồ có sẵn để đưa ra một set đồ hoàn hảo nhất. (Demo việc AI gợi ý thành công).”</w:t>
+      </w:r>
+    </w:p>
+    <w:bookmarkEnd w:id="13"/>
+    <w:bookmarkStart w:id="14" w:name="X0ea5141ceb4c1af5055b47f811831b9ed0baf41"/>
+    <w:p>
+      <w:pPr>
+        <w:pStyle w:val="Heading3"/>
+      </w:pPr>
+      <w:r>
+        <w:t xml:space="preserve">Bước 4: Màn hình Profile tinh tế &amp; Quản lý Sở thích</w:t>
       </w:r>
     </w:p>
     <w:p>
@@ -527,147 +585,25 @@
           <w:b/>
           <w:bCs/>
         </w:rPr>
-        <w:t xml:space="preserve">Cách Demo:</w:t>
-      </w:r>
-    </w:p>
-    <w:p>
-      <w:pPr>
-        <w:pStyle w:val="Compact"/>
-        <w:numPr>
-          <w:ilvl w:val="1"/>
-          <w:numId w:val="1007"/>
-        </w:numPr>
-      </w:pPr>
-      <w:r>
-        <w:t xml:space="preserve">Ở tab</w:t>
-      </w:r>
-      <w:r>
-        <w:t xml:space="preserve"> </w:t>
-      </w:r>
-      <w:r>
-        <w:rPr>
-          <w:b/>
-          <w:bCs/>
-        </w:rPr>
-        <w:t xml:space="preserve">“Phối đồ”</w:t>
-      </w:r>
-      <w:r>
-        <w:t xml:space="preserve">, bấm vào nút</w:t>
-      </w:r>
-      <w:r>
-        <w:t xml:space="preserve"> </w:t>
-      </w:r>
-      <w:r>
-        <w:rPr>
-          <w:b/>
-          <w:bCs/>
-        </w:rPr>
-        <w:t xml:space="preserve">“Quẹt Outfit (Tinder Mix)”</w:t>
-      </w:r>
-      <w:r>
-        <w:t xml:space="preserve"> </w:t>
-      </w:r>
-      <w:r>
-        <w:t xml:space="preserve">màu hồng lấp lánh.</w:t>
-      </w:r>
-    </w:p>
-    <w:p>
-      <w:pPr>
-        <w:pStyle w:val="Compact"/>
-        <w:numPr>
-          <w:ilvl w:val="1"/>
-          <w:numId w:val="1007"/>
-        </w:numPr>
-      </w:pPr>
-      <w:r>
-        <w:t xml:space="preserve">Màn hình hiện ra một thẻ bài (Card) mix ngẫu nhiên Áo - Quần - Giày.</w:t>
-      </w:r>
-    </w:p>
-    <w:p>
-      <w:pPr>
-        <w:pStyle w:val="Compact"/>
-        <w:numPr>
-          <w:ilvl w:val="1"/>
-          <w:numId w:val="1007"/>
-        </w:numPr>
-      </w:pPr>
-      <w:r>
-        <w:rPr>
-          <w:b/>
-          <w:bCs/>
-        </w:rPr>
-        <w:t xml:space="preserve">Quẹt trái (Vuốt qua trái):</w:t>
-      </w:r>
-      <w:r>
-        <w:t xml:space="preserve"> </w:t>
-      </w:r>
-      <w:r>
-        <w:t xml:space="preserve">Nếu thấy bộ đồ này gớm quá, vuốt bỏ đi. Thẻ bài khác sẽ hiện lên.</w:t>
-      </w:r>
-    </w:p>
-    <w:p>
-      <w:pPr>
-        <w:pStyle w:val="Compact"/>
-        <w:numPr>
-          <w:ilvl w:val="1"/>
-          <w:numId w:val="1007"/>
-        </w:numPr>
-      </w:pPr>
-      <w:r>
-        <w:rPr>
-          <w:b/>
-          <w:bCs/>
-        </w:rPr>
-        <w:t xml:space="preserve">Quẹt phải (Vuốt qua phải):</w:t>
-      </w:r>
-      <w:r>
-        <w:t xml:space="preserve"> </w:t>
-      </w:r>
-      <w:r>
-        <w:t xml:space="preserve">Bấm vuốt sang phải, màn hình sẽ bắn pháo hoa 🎉. Báo cho khách biết bộ này đã được hệ thống ngầm lưu lại!</w:t>
-      </w:r>
-    </w:p>
-    <w:bookmarkEnd w:id="12"/>
-    <w:bookmarkStart w:id="13" w:name="chấm-điểm-hợp-màu-color-harmony-score"/>
-    <w:p>
-      <w:pPr>
-        <w:pStyle w:val="Heading3"/>
-      </w:pPr>
-      <w:r>
-        <w:t xml:space="preserve">4. Chấm Điểm Hợp Màu (Color Harmony Score)</w:t>
-      </w:r>
-    </w:p>
-    <w:p>
-      <w:pPr>
-        <w:pStyle w:val="FirstParagraph"/>
-      </w:pPr>
-      <w:r>
-        <w:rPr>
-          <w:i/>
-          <w:iCs/>
-        </w:rPr>
-        <w:t xml:space="preserve">Ý nghĩa: Tính năng</w:t>
-      </w:r>
-      <w:r>
-        <w:rPr>
-          <w:i/>
-          <w:iCs/>
-        </w:rPr>
-        <w:t xml:space="preserve"> </w:t>
-      </w:r>
-      <w:r>
-        <w:rPr>
-          <w:i/>
-          <w:iCs/>
-        </w:rPr>
-        <w:t xml:space="preserve">“Chống mù màu”</w:t>
-      </w:r>
-      <w:r>
-        <w:rPr>
-          <w:i/>
-          <w:iCs/>
-        </w:rPr>
-        <w:t xml:space="preserve">, giúp người dùng không bao giờ mặc sai tone.</w:t>
+        <w:t xml:space="preserve">Thao tác:</w:t>
+      </w:r>
+      <w:r>
+        <w:t xml:space="preserve"> </w:t>
+      </w:r>
+      <w:r>
+        <w:t xml:space="preserve">Chuyển sang Tab</w:t>
+      </w:r>
+      <w:r>
+        <w:t xml:space="preserve"> </w:t>
+      </w:r>
+      <w:r>
+        <w:t xml:space="preserve">“Tôi”</w:t>
+      </w:r>
+      <w:r>
+        <w:t xml:space="preserve"> </w:t>
+      </w:r>
+      <w:r>
+        <w:t xml:space="preserve">(Profile).</w:t>
       </w:r>
     </w:p>
     <w:p>
@@ -675,7 +611,7 @@
         <w:pStyle w:val="Compact"/>
         <w:numPr>
           <w:ilvl w:val="0"/>
-          <w:numId w:val="1008"/>
+          <w:numId w:val="1006"/>
         </w:numPr>
       </w:pPr>
       <w:r>
@@ -683,126 +619,53 @@
           <w:b/>
           <w:bCs/>
         </w:rPr>
-        <w:t xml:space="preserve">Cách Demo:</w:t>
-      </w:r>
-    </w:p>
-    <w:p>
-      <w:pPr>
-        <w:pStyle w:val="Compact"/>
-        <w:numPr>
-          <w:ilvl w:val="1"/>
-          <w:numId w:val="1009"/>
-        </w:numPr>
-      </w:pPr>
-      <w:r>
-        <w:t xml:space="preserve">Vẫn ở tab</w:t>
-      </w:r>
-      <w:r>
-        <w:t xml:space="preserve"> </w:t>
-      </w:r>
-      <w:r>
-        <w:rPr>
-          <w:b/>
-          <w:bCs/>
-        </w:rPr>
-        <w:t xml:space="preserve">“Phối đồ”</w:t>
-      </w:r>
-      <w:r>
-        <w:t xml:space="preserve">, kéo xuống dưới cùng, chọn</w:t>
-      </w:r>
-      <w:r>
-        <w:t xml:space="preserve"> </w:t>
-      </w:r>
-      <w:r>
-        <w:rPr>
-          <w:b/>
-          <w:bCs/>
-        </w:rPr>
-        <w:t xml:space="preserve">“Chấm Điểm Hợp Màu”</w:t>
-      </w:r>
-      <w:r>
-        <w:t xml:space="preserve">.</w:t>
-      </w:r>
-    </w:p>
-    <w:p>
-      <w:pPr>
-        <w:pStyle w:val="Compact"/>
-        <w:numPr>
-          <w:ilvl w:val="1"/>
-          <w:numId w:val="1009"/>
-        </w:numPr>
-      </w:pPr>
-      <w:r>
-        <w:t xml:space="preserve">Bấm vào 2 ô trống, chọn ra 2 món đồ bất kỳ trong tủ. (Mẹo: Cố tình chọn 2 món có màu chói nhau để xem AI nói gì, hoặc 2 món tone-sur-tone).</w:t>
-      </w:r>
-    </w:p>
-    <w:p>
-      <w:pPr>
-        <w:pStyle w:val="Compact"/>
-        <w:numPr>
-          <w:ilvl w:val="1"/>
-          <w:numId w:val="1009"/>
-        </w:numPr>
-      </w:pPr>
-      <w:r>
-        <w:t xml:space="preserve">Bấm</w:t>
-      </w:r>
-      <w:r>
-        <w:t xml:space="preserve"> </w:t>
-      </w:r>
-      <w:r>
-        <w:rPr>
-          <w:b/>
-          <w:bCs/>
-        </w:rPr>
-        <w:t xml:space="preserve">“Phân tích”</w:t>
-      </w:r>
-      <w:r>
-        <w:t xml:space="preserve">.</w:t>
-      </w:r>
-    </w:p>
-    <w:p>
-      <w:pPr>
-        <w:pStyle w:val="Compact"/>
-        <w:numPr>
-          <w:ilvl w:val="1"/>
-          <w:numId w:val="1009"/>
-        </w:numPr>
-      </w:pPr>
-      <w:r>
-        <w:rPr>
-          <w:b/>
-          <w:bCs/>
-        </w:rPr>
-        <w:t xml:space="preserve">Điểm nhấn để khoe khách:</w:t>
-      </w:r>
-      <w:r>
-        <w:t xml:space="preserve"> </w:t>
-      </w:r>
-      <w:r>
-        <w:t xml:space="preserve">AI sẽ trả về thang điểm 100 và nhận xét chi tiết đây là quy tắc phối màu gì (Tương phản, Tương đồng, Đơn sắc…) và chỉ ra điểm chưa hợp lý.</w:t>
-      </w:r>
-    </w:p>
-    <w:bookmarkEnd w:id="13"/>
-    <w:bookmarkStart w:id="14" w:name="Xcd695128c55dd5d359cc04df52c659783c90ef2"/>
-    <w:p>
-      <w:pPr>
-        <w:pStyle w:val="Heading3"/>
-      </w:pPr>
-      <w:r>
-        <w:t xml:space="preserve">5. Lên Kế Hoạch (Plan Ahead) &amp; Đồng bộ Google Calendar</w:t>
-      </w:r>
-    </w:p>
-    <w:p>
-      <w:pPr>
-        <w:pStyle w:val="FirstParagraph"/>
-      </w:pPr>
+        <w:t xml:space="preserve">Lời dẫn:</w:t>
+      </w:r>
+      <w:r>
+        <w:t xml:space="preserve"> </w:t>
+      </w:r>
+      <w:r>
+        <w:t xml:space="preserve">&gt;</w:t>
+      </w:r>
+      <w:r>
+        <w:t xml:space="preserve"> </w:t>
+      </w:r>
       <w:r>
         <w:rPr>
           <w:i/>
           <w:iCs/>
         </w:rPr>
-        <w:t xml:space="preserve">Ý nghĩa: Tính năng dân văn phòng/sinh viên cực thích.</w:t>
+        <w:t xml:space="preserve">“Ở màn hình Cá nhân, các thông số về tủ đồ (Tổng số đồ, Đồ yêu thích) được thống kê rõ ràng. Các cài đặt cá nhân như Giới tính, Phong cách sở thích được thiết kế dưới dạng thẻ (Card) đổ bóng bo góc cực kỳ hiện đại, giúp ứng dụng không hề kém cạnh bất kỳ sản phẩm thương mại nào trên thị trường.”</w:t>
+      </w:r>
+    </w:p>
+    <w:p>
+      <w:r>
+        <w:pict>
+          <v:rect style="width:0;height:1.5pt" o:hralign="center" o:hrstd="t" o:hr="t"/>
+        </w:pict>
+      </w:r>
+    </w:p>
+    <w:bookmarkEnd w:id="14"/>
+    <w:bookmarkEnd w:id="15"/>
+    <w:bookmarkStart w:id="16" w:name="tầm-nhìn-tương-lai-chốt-hạ-ấn-tượng"/>
+    <w:p>
+      <w:pPr>
+        <w:pStyle w:val="Heading2"/>
+      </w:pPr>
+      <w:r>
+        <w:t xml:space="preserve">4. TẦM NHÌN TƯƠNG LAI (Chốt hạ ấn tượng)</w:t>
+      </w:r>
+    </w:p>
+    <w:p>
+      <w:pPr>
+        <w:pStyle w:val="FirstParagraph"/>
+      </w:pPr>
+      <w:r>
+        <w:rPr>
+          <w:i/>
+          <w:iCs/>
+        </w:rPr>
+        <w:t xml:space="preserve">(Nếu Hội đồng hỏi về hướng phát triển hoặc để tự nói vào cuối buổi)</w:t>
       </w:r>
     </w:p>
     <w:p>
@@ -810,7 +673,7 @@
         <w:pStyle w:val="Compact"/>
         <w:numPr>
           <w:ilvl w:val="0"/>
-          <w:numId w:val="1010"/>
+          <w:numId w:val="1007"/>
         </w:numPr>
       </w:pPr>
       <w:r>
@@ -818,198 +681,22 @@
           <w:b/>
           <w:bCs/>
         </w:rPr>
-        <w:t xml:space="preserve">Cách Demo:</w:t>
-      </w:r>
-    </w:p>
-    <w:p>
-      <w:pPr>
-        <w:pStyle w:val="Compact"/>
-        <w:numPr>
-          <w:ilvl w:val="1"/>
-          <w:numId w:val="1011"/>
-        </w:numPr>
-      </w:pPr>
-      <w:r>
-        <w:t xml:space="preserve">Về màn hình chính (tab</w:t>
-      </w:r>
-      <w:r>
-        <w:t xml:space="preserve"> </w:t>
-      </w:r>
-      <w:r>
-        <w:rPr>
-          <w:b/>
-          <w:bCs/>
-        </w:rPr>
-        <w:t xml:space="preserve">Home</w:t>
-      </w:r>
-      <w:r>
-        <w:t xml:space="preserve">), bấm vào nút</w:t>
-      </w:r>
-      <w:r>
-        <w:t xml:space="preserve"> </w:t>
-      </w:r>
-      <w:r>
-        <w:rPr>
-          <w:b/>
-          <w:bCs/>
-        </w:rPr>
-        <w:t xml:space="preserve">“Lên Kế Hoạch”</w:t>
-      </w:r>
-      <w:r>
-        <w:t xml:space="preserve"> </w:t>
-      </w:r>
-      <w:r>
-        <w:t xml:space="preserve">(biểu tượng lịch).</w:t>
-      </w:r>
-    </w:p>
-    <w:p>
-      <w:pPr>
-        <w:pStyle w:val="Compact"/>
-        <w:numPr>
-          <w:ilvl w:val="1"/>
-          <w:numId w:val="1011"/>
-        </w:numPr>
-      </w:pPr>
-      <w:r>
-        <w:t xml:space="preserve">Bấm dấu</w:t>
-      </w:r>
-      <w:r>
-        <w:t xml:space="preserve"> </w:t>
-      </w:r>
-      <w:r>
-        <w:rPr>
-          <w:b/>
-          <w:bCs/>
-        </w:rPr>
-        <w:t xml:space="preserve">“+”</w:t>
-      </w:r>
-      <w:r>
-        <w:t xml:space="preserve"> </w:t>
-      </w:r>
-      <w:r>
-        <w:t xml:space="preserve">góc phải.</w:t>
-      </w:r>
-    </w:p>
-    <w:p>
-      <w:pPr>
-        <w:pStyle w:val="Compact"/>
-        <w:numPr>
-          <w:ilvl w:val="1"/>
-          <w:numId w:val="1011"/>
-        </w:numPr>
-      </w:pPr>
-      <w:r>
-        <w:t xml:space="preserve">Chọn ngày, giờ trong</w:t>
-      </w:r>
-      <w:r>
-        <w:t xml:space="preserve"> </w:t>
-      </w:r>
-      <w:r>
-        <w:rPr>
-          <w:i/>
-          <w:iCs/>
-        </w:rPr>
-        <w:t xml:space="preserve">tương lai</w:t>
-      </w:r>
-      <w:r>
-        <w:t xml:space="preserve"> </w:t>
-      </w:r>
-      <w:r>
-        <w:t xml:space="preserve">(Lưu ý: App có cơ chế chặn không cho chọn ngày trong quá khứ).</w:t>
-      </w:r>
-    </w:p>
-    <w:p>
-      <w:pPr>
-        <w:pStyle w:val="Compact"/>
-        <w:numPr>
-          <w:ilvl w:val="1"/>
-          <w:numId w:val="1011"/>
-        </w:numPr>
-      </w:pPr>
-      <w:r>
-        <w:t xml:space="preserve">Nhập tiêu đề (VD:</w:t>
-      </w:r>
-      <w:r>
-        <w:t xml:space="preserve"> </w:t>
-      </w:r>
-      <w:r>
-        <w:rPr>
-          <w:i/>
-          <w:iCs/>
-        </w:rPr>
-        <w:t xml:space="preserve">Đi hẹn hò</w:t>
-      </w:r>
-      <w:r>
-        <w:t xml:space="preserve">), chọn một bộ Outfit có sẵn.</w:t>
-      </w:r>
-    </w:p>
-    <w:p>
-      <w:pPr>
-        <w:pStyle w:val="Compact"/>
-        <w:numPr>
-          <w:ilvl w:val="1"/>
-          <w:numId w:val="1011"/>
-        </w:numPr>
-      </w:pPr>
-      <w:r>
-        <w:t xml:space="preserve">Bấm</w:t>
-      </w:r>
-      <w:r>
-        <w:t xml:space="preserve"> </w:t>
-      </w:r>
-      <w:r>
-        <w:rPr>
-          <w:b/>
-          <w:bCs/>
-        </w:rPr>
-        <w:t xml:space="preserve">Lưu</w:t>
-      </w:r>
-      <w:r>
-        <w:t xml:space="preserve">.</w:t>
-      </w:r>
-    </w:p>
-    <w:p>
-      <w:pPr>
-        <w:pStyle w:val="Compact"/>
-        <w:numPr>
-          <w:ilvl w:val="1"/>
-          <w:numId w:val="1011"/>
-        </w:numPr>
-      </w:pPr>
-      <w:r>
-        <w:rPr>
-          <w:b/>
-          <w:bCs/>
-        </w:rPr>
-        <w:t xml:space="preserve">Điểm nhấn để khoe khách:</w:t>
-      </w:r>
-      <w:r>
-        <w:t xml:space="preserve"> </w:t>
-      </w:r>
-      <w:r>
-        <w:t xml:space="preserve">“Khi em bấm lưu ở đây, lịch trình này sẽ ngay lập tức bay thẳng vào Google Calendar trên điện thoại của khách hàng để báo thức nhắc nhở!”</w:t>
-      </w:r>
-    </w:p>
-    <w:bookmarkEnd w:id="14"/>
-    <w:bookmarkStart w:id="15" w:name="lookbook-trợ-lý-dọn-tủ"/>
-    <w:p>
-      <w:pPr>
-        <w:pStyle w:val="Heading3"/>
-      </w:pPr>
-      <w:r>
-        <w:t xml:space="preserve">6. Lookbook &amp; Trợ lý Dọn Tủ</w:t>
-      </w:r>
-    </w:p>
-    <w:p>
-      <w:pPr>
-        <w:pStyle w:val="FirstParagraph"/>
-      </w:pPr>
-      <w:r>
-        <w:rPr>
-          <w:i/>
-          <w:iCs/>
-        </w:rPr>
-        <w:t xml:space="preserve">Ý nghĩa: Tính năng quản lý đồ đạc và phong cách lâu dài.</w:t>
+        <w:t xml:space="preserve">Dọn Dẹp Tủ Đồ (Wardrobe Cleanup AI):</w:t>
+      </w:r>
+      <w:r>
+        <w:t xml:space="preserve"> </w:t>
+      </w:r>
+      <w:r>
+        <w:t xml:space="preserve">Ứng dụng sẽ tự động phân tích tần suất mặc, sau đó đưa ra</w:t>
+      </w:r>
+      <w:r>
+        <w:t xml:space="preserve"> </w:t>
+      </w:r>
+      <w:r>
+        <w:t xml:space="preserve">“Chiến dịch Detox tủ đồ”</w:t>
+      </w:r>
+      <w:r>
+        <w:t xml:space="preserve">, gợi ý bán thanh lý hoặc quyên góp những món đồ đã lâu không chạm tới.</w:t>
       </w:r>
     </w:p>
     <w:p>
@@ -1017,7 +704,7 @@
         <w:pStyle w:val="Compact"/>
         <w:numPr>
           <w:ilvl w:val="0"/>
-          <w:numId w:val="1012"/>
+          <w:numId w:val="1007"/>
         </w:numPr>
       </w:pPr>
       <w:r>
@@ -1025,91 +712,25 @@
           <w:b/>
           <w:bCs/>
         </w:rPr>
-        <w:t xml:space="preserve">Cách Demo:</w:t>
-      </w:r>
-    </w:p>
-    <w:p>
-      <w:pPr>
-        <w:pStyle w:val="Compact"/>
-        <w:numPr>
-          <w:ilvl w:val="1"/>
-          <w:numId w:val="1013"/>
-        </w:numPr>
-      </w:pPr>
-      <w:r>
-        <w:t xml:space="preserve">Mở tab</w:t>
-      </w:r>
-      <w:r>
-        <w:t xml:space="preserve"> </w:t>
-      </w:r>
-      <w:r>
-        <w:rPr>
-          <w:b/>
-          <w:bCs/>
-        </w:rPr>
-        <w:t xml:space="preserve">“Tôi”</w:t>
-      </w:r>
-      <w:r>
-        <w:t xml:space="preserve"> </w:t>
-      </w:r>
-      <w:r>
-        <w:t xml:space="preserve">(Trang cá nhân góc phải dưới).</w:t>
-      </w:r>
-    </w:p>
-    <w:p>
-      <w:pPr>
-        <w:pStyle w:val="Compact"/>
-        <w:numPr>
-          <w:ilvl w:val="1"/>
-          <w:numId w:val="1013"/>
-        </w:numPr>
-      </w:pPr>
-      <w:r>
-        <w:t xml:space="preserve">Chọn</w:t>
-      </w:r>
-      <w:r>
-        <w:t xml:space="preserve"> </w:t>
-      </w:r>
-      <w:r>
-        <w:rPr>
-          <w:b/>
-          <w:bCs/>
-        </w:rPr>
-        <w:t xml:space="preserve">“Lookbook (Set đồ đã lưu)”</w:t>
-      </w:r>
-      <w:r>
-        <w:t xml:space="preserve"> </w:t>
-      </w:r>
-      <w:r>
-        <w:t xml:space="preserve">-&gt; Mở cho khách xem những bộ đồ khi nãy ta vừa bấm lưu (từ AI gợi ý và từ lúc quẹt Tinder). Nhấn mạnh tốc độ load cực mượt.</w:t>
-      </w:r>
-    </w:p>
-    <w:p>
-      <w:pPr>
-        <w:pStyle w:val="Compact"/>
-        <w:numPr>
-          <w:ilvl w:val="1"/>
-          <w:numId w:val="1013"/>
-        </w:numPr>
-      </w:pPr>
-      <w:r>
-        <w:t xml:space="preserve">Quay lại, chọn</w:t>
-      </w:r>
-      <w:r>
-        <w:t xml:space="preserve"> </w:t>
-      </w:r>
-      <w:r>
-        <w:rPr>
-          <w:b/>
-          <w:bCs/>
-        </w:rPr>
-        <w:t xml:space="preserve">“Dọn tủ đồ”</w:t>
-      </w:r>
-      <w:r>
-        <w:t xml:space="preserve"> </w:t>
-      </w:r>
-      <w:r>
-        <w:t xml:space="preserve">-&gt; Màn hình sẽ hiện ra những món đồ bám bụi lâu ngày chưa mặc, AI sẽ khuyên người dùng nên thanh lý đi cho gọn tủ.</w:t>
+        <w:t xml:space="preserve">Trải nghiệm vuốt Tinder cho Set đồ:</w:t>
+      </w:r>
+      <w:r>
+        <w:t xml:space="preserve"> </w:t>
+      </w:r>
+      <w:r>
+        <w:t xml:space="preserve">Ứng dụng sẽ đưa ra các gợi ý mix&amp;match mỗi ngày, người dùng chỉ cần vuốt trái (Bỏ qua) hoặc vuốt phải (Thích) để AI học hỏi và ngày càng</w:t>
+      </w:r>
+      <w:r>
+        <w:t xml:space="preserve"> </w:t>
+      </w:r>
+      <w:r>
+        <w:t xml:space="preserve">“bắt đúng gu”</w:t>
+      </w:r>
+      <w:r>
+        <w:t xml:space="preserve"> </w:t>
+      </w:r>
+      <w:r>
+        <w:t xml:space="preserve">hơn.</w:t>
       </w:r>
     </w:p>
     <w:p>
@@ -1128,54 +749,9 @@
           <w:b/>
           <w:bCs/>
         </w:rPr>
-        <w:t xml:space="preserve">LƯU Ý QUAN TRỌNG KHI DEMO:</w:t>
-      </w:r>
-      <w:r>
-        <w:t xml:space="preserve"> </w:t>
-      </w:r>
-      <w:r>
-        <w:t xml:space="preserve">-</w:t>
-      </w:r>
-      <w:r>
-        <w:t xml:space="preserve"> </w:t>
-      </w:r>
-      <w:r>
-        <w:rPr>
-          <w:i/>
-          <w:iCs/>
-        </w:rPr>
-        <w:t xml:space="preserve">Cứ thao tác tự nhiên và tự tin. Hệ thống AI đằng sau đã được trang bị công nghệ</w:t>
-      </w:r>
-      <w:r>
-        <w:rPr>
-          <w:i/>
-          <w:iCs/>
-        </w:rPr>
-        <w:t xml:space="preserve"> </w:t>
-      </w:r>
-      <w:r>
-        <w:rPr>
-          <w:i/>
-          <w:iCs/>
-        </w:rPr>
-        <w:t xml:space="preserve">“Auto Key-Rotation”</w:t>
-      </w:r>
-      <w:r>
-        <w:rPr>
-          <w:i/>
-          <w:iCs/>
-        </w:rPr>
-        <w:t xml:space="preserve"> </w:t>
-      </w:r>
-      <w:r>
-        <w:rPr>
-          <w:i/>
-          <w:iCs/>
-        </w:rPr>
-        <w:t xml:space="preserve">với 12 bình xăng dự phòng, cứ thoải mái bắt AI xử lý liên tục mà không bao giờ sợ bị lỗi sập hệ thống (Lỗi 429).</w:t>
-      </w:r>
-    </w:p>
-    <w:bookmarkEnd w:id="15"/>
+        <w:t xml:space="preserve">Chúc buổi thuyết trình thành công rực rỡ! Hãy tự tin vì ứng dụng của bạn hiện tại đã đạt đến độ hoàn thiện rất cao cả về Logic lẫn Thẩm mỹ.</w:t>
+      </w:r>
+    </w:p>
     <w:bookmarkEnd w:id="16"/>
     <w:bookmarkEnd w:id="17"/>
     <w:sectPr>
@@ -1391,91 +967,6 @@
       </w:rPr>
     </w:lvl>
   </w:abstractNum>
-  <w:abstractNum w:abstractNumId="99411">
-    <w:nsid w:val="00A99411"/>
-    <w:multiLevelType w:val="multilevel"/>
-    <w:lvl w:ilvl="0">
-      <w:start w:val="1"/>
-      <w:numFmt w:val="decimal"/>
-      <w:lvlText w:val="%1."/>
-      <w:lvlJc w:val="left"/>
-      <w:pPr>
-        <w:ind w:left="720" w:hanging="360"/>
-      </w:pPr>
-    </w:lvl>
-    <w:lvl w:ilvl="1">
-      <w:start w:val="1"/>
-      <w:numFmt w:val="decimal"/>
-      <w:lvlText w:val="%2."/>
-      <w:lvlJc w:val="left"/>
-      <w:pPr>
-        <w:ind w:left="1440" w:hanging="360"/>
-      </w:pPr>
-    </w:lvl>
-    <w:lvl w:ilvl="2">
-      <w:start w:val="1"/>
-      <w:numFmt w:val="decimal"/>
-      <w:lvlText w:val="%3."/>
-      <w:lvlJc w:val="left"/>
-      <w:pPr>
-        <w:ind w:left="2160" w:hanging="360"/>
-      </w:pPr>
-    </w:lvl>
-    <w:lvl w:ilvl="3">
-      <w:start w:val="1"/>
-      <w:numFmt w:val="decimal"/>
-      <w:lvlText w:val="%4."/>
-      <w:lvlJc w:val="left"/>
-      <w:pPr>
-        <w:ind w:left="2880" w:hanging="360"/>
-      </w:pPr>
-    </w:lvl>
-    <w:lvl w:ilvl="4">
-      <w:start w:val="1"/>
-      <w:numFmt w:val="decimal"/>
-      <w:lvlText w:val="%5."/>
-      <w:lvlJc w:val="left"/>
-      <w:pPr>
-        <w:ind w:left="3600" w:hanging="360"/>
-      </w:pPr>
-    </w:lvl>
-    <w:lvl w:ilvl="5">
-      <w:start w:val="1"/>
-      <w:numFmt w:val="decimal"/>
-      <w:lvlText w:val="%6."/>
-      <w:lvlJc w:val="left"/>
-      <w:pPr>
-        <w:ind w:left="4320" w:hanging="360"/>
-      </w:pPr>
-    </w:lvl>
-    <w:lvl w:ilvl="6">
-      <w:start w:val="1"/>
-      <w:numFmt w:val="decimal"/>
-      <w:lvlText w:val="%7."/>
-      <w:lvlJc w:val="left"/>
-      <w:pPr>
-        <w:ind w:left="5040" w:hanging="360"/>
-      </w:pPr>
-    </w:lvl>
-    <w:lvl w:ilvl="7">
-      <w:start w:val="1"/>
-      <w:numFmt w:val="decimal"/>
-      <w:lvlText w:val="%8."/>
-      <w:lvlJc w:val="left"/>
-      <w:pPr>
-        <w:ind w:left="5760" w:hanging="360"/>
-      </w:pPr>
-    </w:lvl>
-    <w:lvl w:ilvl="8">
-      <w:start w:val="1"/>
-      <w:numFmt w:val="decimal"/>
-      <w:lvlText w:val="%9."/>
-      <w:lvlJc w:val="left"/>
-      <w:pPr>
-        <w:ind w:left="6480" w:hanging="360"/>
-      </w:pPr>
-    </w:lvl>
-  </w:abstractNum>
   <w:num w:numId="1000">
     <w:abstractNumId w:val="990"/>
   </w:num>
@@ -1486,199 +977,19 @@
     <w:abstractNumId w:val="991"/>
   </w:num>
   <w:num w:numId="1003">
-    <w:abstractNumId w:val="99411"/>
-    <w:lvlOverride w:ilvl="0">
-      <w:startOverride w:val="1"/>
-    </w:lvlOverride>
-    <w:lvlOverride w:ilvl="1">
-      <w:startOverride w:val="1"/>
-    </w:lvlOverride>
-    <w:lvlOverride w:ilvl="2">
-      <w:startOverride w:val="1"/>
-    </w:lvlOverride>
-    <w:lvlOverride w:ilvl="3">
-      <w:startOverride w:val="1"/>
-    </w:lvlOverride>
-    <w:lvlOverride w:ilvl="4">
-      <w:startOverride w:val="1"/>
-    </w:lvlOverride>
-    <w:lvlOverride w:ilvl="5">
-      <w:startOverride w:val="1"/>
-    </w:lvlOverride>
-    <w:lvlOverride w:ilvl="6">
-      <w:startOverride w:val="1"/>
-    </w:lvlOverride>
-    <w:lvlOverride w:ilvl="7">
-      <w:startOverride w:val="1"/>
-    </w:lvlOverride>
-    <w:lvlOverride w:ilvl="8">
-      <w:startOverride w:val="1"/>
-    </w:lvlOverride>
+    <w:abstractNumId w:val="991"/>
   </w:num>
   <w:num w:numId="1004">
     <w:abstractNumId w:val="991"/>
   </w:num>
   <w:num w:numId="1005">
-    <w:abstractNumId w:val="99411"/>
-    <w:lvlOverride w:ilvl="0">
-      <w:startOverride w:val="1"/>
-    </w:lvlOverride>
-    <w:lvlOverride w:ilvl="1">
-      <w:startOverride w:val="1"/>
-    </w:lvlOverride>
-    <w:lvlOverride w:ilvl="2">
-      <w:startOverride w:val="1"/>
-    </w:lvlOverride>
-    <w:lvlOverride w:ilvl="3">
-      <w:startOverride w:val="1"/>
-    </w:lvlOverride>
-    <w:lvlOverride w:ilvl="4">
-      <w:startOverride w:val="1"/>
-    </w:lvlOverride>
-    <w:lvlOverride w:ilvl="5">
-      <w:startOverride w:val="1"/>
-    </w:lvlOverride>
-    <w:lvlOverride w:ilvl="6">
-      <w:startOverride w:val="1"/>
-    </w:lvlOverride>
-    <w:lvlOverride w:ilvl="7">
-      <w:startOverride w:val="1"/>
-    </w:lvlOverride>
-    <w:lvlOverride w:ilvl="8">
-      <w:startOverride w:val="1"/>
-    </w:lvlOverride>
+    <w:abstractNumId w:val="991"/>
   </w:num>
   <w:num w:numId="1006">
     <w:abstractNumId w:val="991"/>
   </w:num>
   <w:num w:numId="1007">
-    <w:abstractNumId w:val="99411"/>
-    <w:lvlOverride w:ilvl="0">
-      <w:startOverride w:val="1"/>
-    </w:lvlOverride>
-    <w:lvlOverride w:ilvl="1">
-      <w:startOverride w:val="1"/>
-    </w:lvlOverride>
-    <w:lvlOverride w:ilvl="2">
-      <w:startOverride w:val="1"/>
-    </w:lvlOverride>
-    <w:lvlOverride w:ilvl="3">
-      <w:startOverride w:val="1"/>
-    </w:lvlOverride>
-    <w:lvlOverride w:ilvl="4">
-      <w:startOverride w:val="1"/>
-    </w:lvlOverride>
-    <w:lvlOverride w:ilvl="5">
-      <w:startOverride w:val="1"/>
-    </w:lvlOverride>
-    <w:lvlOverride w:ilvl="6">
-      <w:startOverride w:val="1"/>
-    </w:lvlOverride>
-    <w:lvlOverride w:ilvl="7">
-      <w:startOverride w:val="1"/>
-    </w:lvlOverride>
-    <w:lvlOverride w:ilvl="8">
-      <w:startOverride w:val="1"/>
-    </w:lvlOverride>
-  </w:num>
-  <w:num w:numId="1008">
     <w:abstractNumId w:val="991"/>
-  </w:num>
-  <w:num w:numId="1009">
-    <w:abstractNumId w:val="99411"/>
-    <w:lvlOverride w:ilvl="0">
-      <w:startOverride w:val="1"/>
-    </w:lvlOverride>
-    <w:lvlOverride w:ilvl="1">
-      <w:startOverride w:val="1"/>
-    </w:lvlOverride>
-    <w:lvlOverride w:ilvl="2">
-      <w:startOverride w:val="1"/>
-    </w:lvlOverride>
-    <w:lvlOverride w:ilvl="3">
-      <w:startOverride w:val="1"/>
-    </w:lvlOverride>
-    <w:lvlOverride w:ilvl="4">
-      <w:startOverride w:val="1"/>
-    </w:lvlOverride>
-    <w:lvlOverride w:ilvl="5">
-      <w:startOverride w:val="1"/>
-    </w:lvlOverride>
-    <w:lvlOverride w:ilvl="6">
-      <w:startOverride w:val="1"/>
-    </w:lvlOverride>
-    <w:lvlOverride w:ilvl="7">
-      <w:startOverride w:val="1"/>
-    </w:lvlOverride>
-    <w:lvlOverride w:ilvl="8">
-      <w:startOverride w:val="1"/>
-    </w:lvlOverride>
-  </w:num>
-  <w:num w:numId="1010">
-    <w:abstractNumId w:val="991"/>
-  </w:num>
-  <w:num w:numId="1011">
-    <w:abstractNumId w:val="99411"/>
-    <w:lvlOverride w:ilvl="0">
-      <w:startOverride w:val="1"/>
-    </w:lvlOverride>
-    <w:lvlOverride w:ilvl="1">
-      <w:startOverride w:val="1"/>
-    </w:lvlOverride>
-    <w:lvlOverride w:ilvl="2">
-      <w:startOverride w:val="1"/>
-    </w:lvlOverride>
-    <w:lvlOverride w:ilvl="3">
-      <w:startOverride w:val="1"/>
-    </w:lvlOverride>
-    <w:lvlOverride w:ilvl="4">
-      <w:startOverride w:val="1"/>
-    </w:lvlOverride>
-    <w:lvlOverride w:ilvl="5">
-      <w:startOverride w:val="1"/>
-    </w:lvlOverride>
-    <w:lvlOverride w:ilvl="6">
-      <w:startOverride w:val="1"/>
-    </w:lvlOverride>
-    <w:lvlOverride w:ilvl="7">
-      <w:startOverride w:val="1"/>
-    </w:lvlOverride>
-    <w:lvlOverride w:ilvl="8">
-      <w:startOverride w:val="1"/>
-    </w:lvlOverride>
-  </w:num>
-  <w:num w:numId="1012">
-    <w:abstractNumId w:val="991"/>
-  </w:num>
-  <w:num w:numId="1013">
-    <w:abstractNumId w:val="99411"/>
-    <w:lvlOverride w:ilvl="0">
-      <w:startOverride w:val="1"/>
-    </w:lvlOverride>
-    <w:lvlOverride w:ilvl="1">
-      <w:startOverride w:val="1"/>
-    </w:lvlOverride>
-    <w:lvlOverride w:ilvl="2">
-      <w:startOverride w:val="1"/>
-    </w:lvlOverride>
-    <w:lvlOverride w:ilvl="3">
-      <w:startOverride w:val="1"/>
-    </w:lvlOverride>
-    <w:lvlOverride w:ilvl="4">
-      <w:startOverride w:val="1"/>
-    </w:lvlOverride>
-    <w:lvlOverride w:ilvl="5">
-      <w:startOverride w:val="1"/>
-    </w:lvlOverride>
-    <w:lvlOverride w:ilvl="6">
-      <w:startOverride w:val="1"/>
-    </w:lvlOverride>
-    <w:lvlOverride w:ilvl="7">
-      <w:startOverride w:val="1"/>
-    </w:lvlOverride>
-    <w:lvlOverride w:ilvl="8">
-      <w:startOverride w:val="1"/>
-    </w:lvlOverride>
   </w:num>
 </w:numbering>
 </file>

</xml_diff>